<commit_message>
Revisão editorial com as skills novas; corrige 4 erros de continuidade
- docs/REVISAO_V2.md: relatório (dev-edit, continuity-check, story-analysis)
- cap. 22: café com o Kuroda passa para junho (ordem cronológica com o cap. 23)
- cap. 26: Maya no terceiro ano da faculdade; placas com seis verões
- epílogo: dezembro, para ficar no inverno do Ano 10
- .docx regenerados

Co-Authored-By: Claude Opus 5.5 <noreply@anthropic.com>
Claude-Session: https://claude.ai/code/session_01Lr8d9xDfMU6kQFdAYADYkt
</commit_message>
<xml_diff>
--- a/saidas/O_Jardim_Entre_o_Agora_e_o_Depois.docx
+++ b/saidas/O_Jardim_Entre_o_Agora_e_o_Depois.docx
@@ -11813,7 +11813,7 @@
         <w:ind w:firstLine="0"/>
       </w:pPr>
       <w:r>
-        <w:t xml:space="preserve">Em outubro daquele ano, encontrou Kuroda num seminário do setor, em Tóquio, num hotel com carpete tão grosso que os passos não faziam barulho.</w:t>
+        <w:t xml:space="preserve">Em junho daquele ano, encontrou Kuroda num seminário do setor, em Tóquio, num hotel com carpete tão grosso que os passos não faziam barulho.</w:t>
       </w:r>
     </w:p>
     <w:p>
@@ -13217,7 +13217,7 @@
     </w:p>
     <w:p>
       <w:r>
-        <w:t xml:space="preserve">Tinha vinte anos, o cabelo mais curto do que em agosto e a mesma cara que fazia aos dez, no palco do recital, olhando para a porta do fundo. Estava no segundo ano de economia. Queria passar para a faculdade de educação, estudar música, dar aula. Tinha pesquisado a transferência, os prazos, os créditos que perderia, o ano a mais. Tinha trazido tudo impresso, numa pasta plástica transparente, um papel em cada plástico.</w:t>
+        <w:t xml:space="preserve">Tinha vinte anos, o cabelo mais curto do que em agosto e a mesma cara que fazia aos dez, no palco do recital, olhando para a porta do fundo. Estava no terceiro ano de economia. Queria passar para a faculdade de educação, estudar música, dar aula. Tinha pesquisado a transferência, os prazos, os créditos que perderia, o ano a mais. Tinha trazido tudo impresso, numa pasta plástica transparente, um papel em cada plástico.</w:t>
       </w:r>
     </w:p>
     <w:p>
@@ -13440,7 +13440,7 @@
     </w:p>
     <w:p>
       <w:r>
-        <w:t xml:space="preserve">Na cerca, as quatro placas estavam onde sempre estiveram, na ordem, escurecidas por cinco verões de sol e chuva. De dia, dava para ler as palavras. No escuro, eram quatro retângulos claros na madeira mais escura. Miguel passou a mão pela primeira, sem ler. A tinta do pincel ainda tinha relevo sob os dedos. Passou pela segunda, pela terceira, e deixou a mão parada na última, que era a que ele tinha demorado mais para tocar, anos antes, na mesa da cozinha.</w:t>
+        <w:t xml:space="preserve">Na cerca, as quatro placas estavam onde sempre estiveram, na ordem, escurecidas por seis verões de sol e chuva. De dia, dava para ler as palavras. No escuro, eram quatro retângulos claros na madeira mais escura. Miguel passou a mão pela primeira, sem ler. A tinta do pincel ainda tinha relevo sob os dedos. Passou pela segunda, pela terceira, e deixou a mão parada na última, que era a que ele tinha demorado mais para tocar, anos antes, na mesa da cozinha.</w:t>
       </w:r>
     </w:p>
     <w:p>
@@ -13495,7 +13495,7 @@
         <w:ind w:firstLine="0"/>
       </w:pPr>
       <w:r>
-        <w:t xml:space="preserve">Em janeiro, a figueira ficou sem nenhuma folha.</w:t>
+        <w:t xml:space="preserve">Em dezembro, a figueira ficou sem nenhuma folha.</w:t>
       </w:r>
     </w:p>
     <w:p>

</xml_diff>

<commit_message>
Aplica itens 1–3 da revisão
- cap. 26: conversa pai–filha dramatizada; fecha o fio do sexto degrau
- cap. 22: despedida da Satomi; cap. 24: Renato após o velório, Mateo e
  Gabriel no primeiro tomate
- limpeza de muletas no livro inteiro (devagar, ficou olhando, como quem,
  pela primeira vez, dobrar em quatro)
- docs/REVISAO_V2.md atualizado; .docx regenerados

Co-Authored-By: Claude Opus 5.5 <noreply@anthropic.com>
Claude-Session: https://claude.ai/code/session_01Lr8d9xDfMU6kQFdAYADYkt
</commit_message>
<xml_diff>
--- a/saidas/O_Jardim_Entre_o_Agora_e_o_Depois.docx
+++ b/saidas/O_Jardim_Entre_o_Agora_e_o_Depois.docx
@@ -674,7 +674,7 @@
     </w:p>
     <w:p>
       <w:r>
-        <w:t xml:space="preserve">Nina se enfiou no quadro de pijama, gritando “oi, vô”, e Maya desceu a escada logo atrás, devagar, ainda com a marca do travesseiro no rosto.</w:t>
+        <w:t xml:space="preserve">Nina se enfiou no quadro de pijama, gritando “oi, vô”, e Maya desceu a escada logo atrás, ainda com a marca do travesseiro no rosto.</w:t>
       </w:r>
     </w:p>
     <w:p>
@@ -1980,7 +1980,7 @@
     </w:p>
     <w:p>
       <w:r>
-        <w:t xml:space="preserve">Ela o encarou por um tempo que Miguel não soube medir. Depois fechou o notebook devagar, sem responder ao cliente, e apontou com o queixo para a sacola.</w:t>
+        <w:t xml:space="preserve">Ela o encarou por um tempo que Miguel não soube medir. Depois fechou o notebook sem responder ao cliente, e apontou com o queixo para a sacola.</w:t>
       </w:r>
     </w:p>
     <w:p>
@@ -2204,7 +2204,7 @@
     </w:p>
     <w:p>
       <w:r>
-        <w:t xml:space="preserve">O celular de Clara vibrou. Ela o virou com a tela para baixo sobre a mesa, devagar, como quem vira uma carta que não quer jogar.</w:t>
+        <w:t xml:space="preserve">O celular de Clara vibrou. Ela o virou com a tela para baixo sobre a mesa, feito uma carta que não se quer jogar.</w:t>
       </w:r>
     </w:p>
     <w:p>
@@ -4439,7 +4439,7 @@
     </w:p>
     <w:p>
       <w:r>
-        <w:t xml:space="preserve">Na primeira música, ela cantou de olhos fechados. Maya ficou olhando para a mãe o tempo todo. Nunca a tinha visto cantar assim.</w:t>
+        <w:t xml:space="preserve">Na primeira música, ela cantou de olhos fechados. Maya não tirou os olhos da mãe. Nunca a tinha visto cantar assim.</w:t>
       </w:r>
     </w:p>
     <w:p>
@@ -5026,7 +5026,7 @@
         <w:ind w:firstLine="0"/>
       </w:pPr>
       <w:r>
-        <w:t xml:space="preserve">Ela balançou a cabeça devagar.</w:t>
+        <w:t xml:space="preserve">Ela balançou a cabeça.</w:t>
       </w:r>
     </w:p>
     <w:p>
@@ -6258,7 +6258,7 @@
     </w:p>
     <w:p>
       <w:r>
-        <w:t xml:space="preserve">Maya leu o aviso no caminho de casa, dobrou em quatro e guardou no bolso de dentro da randoseru.</w:t>
+        <w:t xml:space="preserve">Maya leu o aviso no caminho de casa, dobrou do mesmo jeito e guardou no bolso de dentro da randoseru.</w:t>
       </w:r>
     </w:p>
     <w:p>
@@ -6397,7 +6397,7 @@
     </w:p>
     <w:p>
       <w:r>
-        <w:t xml:space="preserve">Pela janela, entrava o cheiro do kinmokusei, que já começava a cair. Maya dobrou o aviso de novo, em quatro, e o guardou no bolso de dentro da mochila, ao lado do outro. Fechou o zíper até a metade.</w:t>
+        <w:t xml:space="preserve">Pela janela, entrava o cheiro do kinmokusei, que já começava a cair. Maya dobrou o aviso de novo e o guardou no bolso de dentro da mochila, ao lado do outro. Fechou o zíper até a metade.</w:t>
       </w:r>
     </w:p>
     <w:p>
@@ -6524,7 +6524,7 @@
     </w:p>
     <w:p>
       <w:r>
-        <w:t xml:space="preserve">Clara tinha a proposta aberta na página das condições e um dedo parado sobre uma linha. Leu em japonês, devagar.</w:t>
+        <w:t xml:space="preserve">Clara tinha a proposta aberta na página das condições e um dedo parado sobre uma linha. Leu em voz alta, em japonês.</w:t>
       </w:r>
     </w:p>
     <w:p>
@@ -6569,7 +6569,7 @@
     </w:p>
     <w:p>
       <w:r>
-        <w:t xml:space="preserve">Kuroda sorriu pela primeira vez, um sorriso curto, de quem reconhece uma boa pergunta num exame.</w:t>
+        <w:t xml:space="preserve">Kuroda sorriu, um sorriso curto, de quem reconhece uma boa pergunta num exame.</w:t>
       </w:r>
     </w:p>
     <w:p>
@@ -6915,7 +6915,7 @@
     </w:p>
     <w:p>
       <w:r>
-        <w:t xml:space="preserve">Foi Clara quem viu primeiro. Maya estava na porta da cozinha, de pijama e meias, com o cabelo amassado de um lado, com uma mão no batente, como quem está pronta para voltar.</w:t>
+        <w:t xml:space="preserve">Foi Clara quem viu primeiro. Maya estava na porta da cozinha, de pijama e meias, com o cabelo amassado de um lado, com uma mão no batente, pronta para voltar.</w:t>
       </w:r>
     </w:p>
     <w:p>
@@ -7034,7 +7034,7 @@
     </w:p>
     <w:p>
       <w:r>
-        <w:t xml:space="preserve">Maya ficou por último. Segurava o cartaz com as duas mãos, um pouco alto demais, de modo que só se viam os olhos dela por cima. Procurou a própria carteira. Encontrou o pai nela, torto, de chinelos verdes, e ficou olhando para ele um segundo inteiro antes de começar.</w:t>
+        <w:t xml:space="preserve">Maya ficou por último. Segurava o cartaz com as duas mãos, um pouco alto demais, de modo que só se viam os olhos dela por cima. Procurou a própria carteira. Encontrou o pai nela, torto, de chinelos verdes, e demorou um segundo inteiro para começar.</w:t>
       </w:r>
     </w:p>
     <w:p>
@@ -7136,7 +7136,7 @@
     </w:p>
     <w:p>
       <w:r>
-        <w:t xml:space="preserve">A casa pequena de fachada clara tinha agora uma cortina de renda na janela da frente, uma bicicleta infantil encostada no portão e um pé de pimenta num vaso de plástico, que a mãe do Mateo cultivava como quem guarda um pedaço de Lima. Chamava-se dona Rosa. Tinha chegado em março, com duas malas, e desde março cozinhava como se estivesse compensando os anos em que o filho tinha comido sozinho.</w:t>
+        <w:t xml:space="preserve">A casa pequena de fachada clara tinha agora uma cortina de renda na janela da frente, uma bicicleta infantil encostada no portão e um pé de pimenta num vaso de plástico, o único canto de Lima na casa. Chamava-se dona Rosa. Tinha chegado em março, com duas malas, e desde março cozinhava como se estivesse compensando os anos em que o filho tinha comido sozinho.</w:t>
       </w:r>
     </w:p>
     <w:p>
@@ -7206,7 +7206,7 @@
     </w:p>
     <w:p>
       <w:r>
-        <w:t xml:space="preserve">Miguel ficou olhando para o quintal. Gabriel estava de cócoras, e cada vez que se mexia, o calcanhar acendia.</w:t>
+        <w:t xml:space="preserve">Miguel olhou para o quintal. Gabriel estava de cócoras, e cada vez que se mexia, o calcanhar acendia.</w:t>
       </w:r>
     </w:p>
     <w:p>
@@ -7315,7 +7315,7 @@
     </w:p>
     <w:p>
       <w:r>
-        <w:t xml:space="preserve">Depois desceu à garagem, abriu a planilha CENÁRIOS e, na aba de Nagoya, mudou o crescimento do primeiro ano de doze para dezoito por cento. Ficou olhando o número novo por um bom tempo, sem conseguir lembrar de onde ele tinha vindo.</w:t>
+        <w:t xml:space="preserve">Depois desceu à garagem, abriu a planilha CENÁRIOS e, na aba de Nagoya, mudou o crescimento do primeiro ano de doze para dezoito por cento. Depois não conseguiu lembrar de onde o número tinha vindo.</w:t>
       </w:r>
     </w:p>
     <w:p>
@@ -8273,7 +8273,7 @@
         <w:ind w:firstLine="0"/>
       </w:pPr>
       <w:r>
-        <w:t xml:space="preserve">Miguel comprou a passagem à uma e doze da manhã, deitado no escuro, com o celular a um palmo do rosto para a luz não acordá-la. Nagoya, uma conexão no Oriente Médio, outra em São Paulo capital, e depois quatro horas de estrada. Saída no sábado às dez. Clara não estava dormindo. Ficou olhando o teto enquanto ele digitava os números do passaporte dela de cor.</w:t>
+        <w:t xml:space="preserve">Miguel comprou a passagem à uma e doze da manhã, deitado no escuro, com o celular a um palmo do rosto para a luz não acordá-la. Nagoya, uma conexão no Oriente Médio, outra em São Paulo capital, e depois quatro horas de estrada. Saída no sábado às dez. Clara não estava dormindo. Olhava o teto enquanto ele digitava os números do passaporte dela de cor.</w:t>
       </w:r>
     </w:p>
     <w:p>
@@ -8589,7 +8589,7 @@
     </w:p>
     <w:p>
       <w:r>
-        <w:t xml:space="preserve">Miguel abriu a boca para responder o que o fundo queria, o que o mercado queria, o que seria prudente. Clara ergueu a mão antes, na tela, como quem para um carro.</w:t>
+        <w:t xml:space="preserve">Miguel abriu a boca para responder o que o fundo queria, o que o mercado queria, o que seria prudente. Clara ergueu a mão na tela, a palma aberta, antes que ele começasse.</w:t>
       </w:r>
     </w:p>
     <w:p>
@@ -8772,7 +8772,7 @@
     </w:p>
     <w:p>
       <w:r>
-        <w:t xml:space="preserve">A enfermeira da escola falava devagar, com a voz de quem já fez aquela ligação mil vezes. Nina tinha passado mal na excursão, perto do meio-dia. A professora a trouxera de volta de trem. Agora estava na enfermaria, deitada, com trinta e oito e sete. Pela regra da escola, precisava ser buscada por um responsável. Tinham ligado para o número da mãe primeiro.</w:t>
+        <w:t xml:space="preserve">A enfermeira da escola falava com a voz de quem já fez aquela ligação mil vezes. Nina tinha passado mal na excursão, perto do meio-dia. A professora a trouxera de volta de trem. Agora estava na enfermaria, deitada, com trinta e oito e sete. Pela regra da escola, precisava ser buscada por um responsável. Tinham ligado para o número da mãe primeiro.</w:t>
       </w:r>
     </w:p>
     <w:p>
@@ -8909,7 +8909,7 @@
     </w:p>
     <w:p>
       <w:r>
-        <w:t xml:space="preserve">No elevador, descendo vinte andares, Miguel viu as próprias mãos tremerem sobre a alça da pasta e as segurou uma na outra, como quem segura as mãos de outra pessoa.</w:t>
+        <w:t xml:space="preserve">No elevador, descendo vinte andares, Miguel viu as próprias mãos tremerem sobre a alça da pasta e as segurou uma na outra até o térreo.</w:t>
       </w:r>
     </w:p>
     <w:p>
@@ -9029,7 +9029,7 @@
     </w:p>
     <w:p>
       <w:r>
-        <w:t xml:space="preserve">O relógio do micro-ondas mudou de 16:59 para 17:00. Miguel olhou para ele, com a colher de pau parada na mão. O celular estava na cesta do genkan, com a tela para baixo. Não tocou. Ninguém ia ligar. As cinco horas passaram como passava qualquer minuto, e o arroz continuou borbulhando devagar, abrindo pequenas crateras na superfície branca.</w:t>
+        <w:t xml:space="preserve">O relógio do micro-ondas mudou de 16:59 para 17:00. Miguel olhou para ele, com a colher de pau parada na mão. O celular estava na cesta do genkan, com a tela para baixo. Não tocou. Ninguém ia ligar. As cinco horas passaram como passava qualquer minuto, e o arroz continuou borbulhando, abrindo pequenas crateras na superfície branca.</w:t>
       </w:r>
     </w:p>
     <w:p>
@@ -9671,7 +9671,7 @@
     </w:p>
     <w:p>
       <w:r>
-        <w:t xml:space="preserve">Conhecia cada plástico. As certidões, as traduções com os carimbos de cartório, o registro de desembarque do avô, amarelado, com o nome escrito errado. O registro dele no consulado, com a data de quando tinha poucas semanas de vida. Virou as páginas devagar, uma por uma, como o pai virava.</w:t>
+        <w:t xml:space="preserve">Conhecia cada plástico. As certidões, as traduções com os carimbos de cartório, o registro de desembarque do avô, amarelado, com o nome escrito errado. O registro dele no consulado, com a data de quando tinha poucas semanas de vida. Virou as páginas uma por uma, como o pai virava.</w:t>
       </w:r>
     </w:p>
     <w:p>
@@ -10040,7 +10040,7 @@
     </w:p>
     <w:p>
       <w:r>
-        <w:t xml:space="preserve">Ele fechou a boca. Pegou uma fatia do pacote, passou margarina, dobrou ao meio e comeu em quatro mordidas, olhando para Nina. Nina olhou de volta, desconfiada, esperando a palestra que não vinha. Depois pegou a fatia dela e comeu também, devagar, como quem faz um favor.</w:t>
+        <w:t xml:space="preserve">Ele fechou a boca. Pegou uma fatia do pacote, passou margarina, dobrou ao meio e comeu em quatro mordidas, olhando para Nina. Nina olhou de volta, desconfiada, esperando a palestra que não vinha. Depois pegou a fatia dela e comeu também, com cara de quem fazia um favor.</w:t>
       </w:r>
     </w:p>
     <w:p>
@@ -10685,7 +10685,7 @@
     </w:p>
     <w:p>
       <w:r>
-        <w:t xml:space="preserve">Os números tinham envelhecido mal. A versão prudente parecia otimista, e a provável parecia um sonho. Ele ficou olhando a coluna de Osaka, que agora era do William. Depois abriu o e-mail, procurou o último de Kuroda e clicou em responder.</w:t>
+        <w:t xml:space="preserve">Os números tinham envelhecido mal. A versão prudente parecia otimista, e a provável parecia um sonho. Ele parou na coluna de Osaka, que agora era do William. Depois abriu o e-mail, procurou o último de Kuroda e clicou em responder.</w:t>
       </w:r>
     </w:p>
     <w:p>
@@ -10703,7 +10703,7 @@
     </w:p>
     <w:p>
       <w:r>
-        <w:t xml:space="preserve">Enviou às duas e cinquenta e um. Fechou o notebook. Subiu a escada devagar e deitou do lado de Clara, que estava de costas para ele e que ele sabia que estava acordada.</w:t>
+        <w:t xml:space="preserve">Enviou às duas e cinquenta e um. Fechou o notebook. Subiu a escada e deitou do lado de Clara, que estava de costas para ele e que ele sabia que estava acordada.</w:t>
       </w:r>
     </w:p>
     <w:p>
@@ -10770,7 +10770,7 @@
         <w:ind w:firstLine="0"/>
       </w:pPr>
       <w:r>
-        <w:t xml:space="preserve">Clara virou o rosto para ele devagar.</w:t>
+        <w:t xml:space="preserve">Clara virou o rosto para ele.</w:t>
       </w:r>
     </w:p>
     <w:p>
@@ -10883,7 +10883,7 @@
     </w:p>
     <w:p>
       <w:r>
-        <w:t xml:space="preserve">Sentaram na sala de vidro, cada um de um lado da mesa onde o William tinha deixado o envelope branco, quase três anos antes. Ele olhou em volta devagar, para o papel do horário de atendimento na parede, para a mesa da Satomi com a segunda gaveta entreaberta.</w:t>
+        <w:t xml:space="preserve">Sentaram na sala de vidro, cada um de um lado da mesa onde o William tinha deixado o envelope branco, quase três anos antes. Ele olhou em volta, para o papel do horário de atendimento na parede, para a mesa da Satomi com a segunda gaveta entreaberta.</w:t>
       </w:r>
     </w:p>
     <w:p>
@@ -11074,7 +11074,7 @@
     </w:p>
     <w:p>
       <w:r>
-        <w:t xml:space="preserve">Miguel ficou olhando os prédios de Nagoya do outro lado do parapeito. A resposta demorou e, quando veio, não foi bonita.</w:t>
+        <w:t xml:space="preserve">Miguel olhou os prédios de Nagoya do outro lado do parapeito. A resposta demorou e, quando veio, não foi bonita.</w:t>
       </w:r>
     </w:p>
     <w:p>
@@ -11702,6 +11702,24 @@
       </w:r>
     </w:p>
     <w:p>
+      <w:r>
+        <w:t xml:space="preserve">Em março, a Satomi se aposentou. Tinha entrado na Mirai no primeiro ano e saído às seis todos os dias desde então. No último, arrumou a mesa às quatro e meia, como sempre, e às seis menos cinco entregou à Naomi o carimbo da empresa, embrulhado num lenço de pano.</w:t>
+      </w:r>
+    </w:p>
+    <w:p>
+      <w:pPr>
+        <w:ind w:firstLine="0"/>
+      </w:pPr>
+      <w:r>
+        <w:t xml:space="preserve">— Segunda gaveta — disse. — Ninguém nunca lembra.</w:t>
+      </w:r>
+    </w:p>
+    <w:p>
+      <w:r>
+        <w:t xml:space="preserve">Na porta de vidro, fez para Miguel a inclinação curta de todos os dias. Ele retribuiu mais fundo do que ela, e ela fingiu não ver.</w:t>
+      </w:r>
+    </w:p>
+    <w:p>
       <w:pPr>
         <w:spacing w:before="240" w:after="240"/>
         <w:ind w:firstLine="0"/>
@@ -11957,7 +11975,7 @@
     </w:p>
     <w:p>
       <w:r>
-        <w:t xml:space="preserve">Miguel ficou olhando a foto por um tempo, com um contentamento limpo que o surpreendeu, sem nenhuma outra coisa misturada. Digitou.</w:t>
+        <w:t xml:space="preserve">Miguel olhou a foto por um tempo, com um contentamento limpo que o surpreendeu, sem nenhuma outra coisa misturada. Digitou.</w:t>
       </w:r>
     </w:p>
     <w:p>
@@ -12050,7 +12068,7 @@
     </w:p>
     <w:p>
       <w:r>
-        <w:t xml:space="preserve">No fim da tarde, na estrada de terra que ligava o hotel à vila, havia um food truck vendendo karaage, o frango frito japonês, em copos de papel. Nina quis. Miguel pagou, pegou o copo, comeu o primeiro pedaço ali mesmo, em pé, ao lado do balcão de metal, com o óleo quente queimando a ponta dos dedos. Estava ótimo. Clara ficou olhando para ele, com o copo dela na mão, e não disse nada.</w:t>
+        <w:t xml:space="preserve">No fim da tarde, na estrada de terra que ligava o hotel à vila, havia um food truck vendendo karaage, o frango frito japonês, em copos de papel. Nina quis. Miguel pagou, pegou o copo, comeu o primeiro pedaço ali mesmo, em pé, ao lado do balcão de metal, com o óleo quente queimando a ponta dos dedos. Estava ótimo. Clara observava, com o copo dela na mão, e não disse nada.</w:t>
       </w:r>
     </w:p>
     <w:p>
@@ -12552,7 +12570,7 @@
     </w:p>
     <w:p>
       <w:r>
-        <w:t xml:space="preserve">A letra era inclinada e firme, a mesma das placas, só que menor. O japonês era o dos velhos do litoral, e ele o leu devagar, adivinhando algumas palavras pelo contexto.</w:t>
+        <w:t xml:space="preserve">A letra era inclinada e firme, a mesma das placas, só que menor. O japonês era o dos velhos do litoral, e ele o leu duas vezes, adivinhando algumas palavras pelo contexto.</w:t>
       </w:r>
     </w:p>
     <w:p>
@@ -12580,6 +12598,42 @@
         <w:ind w:firstLine="0"/>
       </w:pPr>
       <w:r>
+        <w:t xml:space="preserve">No domingo seguinte, no galpão, Miguel não cantou. Ficou sentado na cadeira de plástico com a carta no bolso da camisa, e o culto passou por cima dele como a chuva passa por cima de um carro.</w:t>
+      </w:r>
+    </w:p>
+    <w:p>
+      <w:r>
+        <w:t xml:space="preserve">Na saída, Renato estava na porta, cumprimentando um por um, com o cabelo mais branco do que Miguel lembrava. Não perguntou nada. Encheu um copo de plástico com o café da garrafa térmica e o pôs na mão dele.</w:t>
+      </w:r>
+    </w:p>
+    <w:p>
+      <w:pPr>
+        <w:ind w:firstLine="0"/>
+      </w:pPr>
+      <w:r>
+        <w:t xml:space="preserve">— Continua ruim — disse.</w:t>
+      </w:r>
+    </w:p>
+    <w:p>
+      <w:r>
+        <w:t xml:space="preserve">Miguel bebeu. Estava ruim e estava quente. Depois ficou para empilhar as cadeiras, e os dois empilharam as sessenta sem falar, uma fileira de cada vez, até o galpão ficar vazio.</w:t>
+      </w:r>
+    </w:p>
+    <w:p>
+      <w:pPr>
+        <w:spacing w:before="240" w:after="240"/>
+        <w:ind w:firstLine="0"/>
+        <w:jc w:val="center"/>
+      </w:pPr>
+      <w:r>
+        <w:t xml:space="preserve">*</w:t>
+      </w:r>
+    </w:p>
+    <w:p>
+      <w:pPr>
+        <w:ind w:firstLine="0"/>
+      </w:pPr>
+      <w:r>
         <w:t xml:space="preserve">A figueira do quintal tinha nascido das três estacas de fevereiro. Duas tinham pegado. Uma tinha secado em junho do primeiro ano, depois de soltar a primeira folha, a que engana. Miguel plantou a sobrevivente no canto do quintal onde batia sol a tarde inteira, com a outra muda num vaso, por precaução, e as duas estavam agora na altura do peito dele, nuas, com os nós grossos de inverno.</w:t>
       </w:r>
     </w:p>
@@ -12610,8 +12664,11 @@
       </w:r>
     </w:p>
     <w:p>
-      <w:r>
-        <w:t xml:space="preserve">Haruka ficou olhando os três gravetos enfiados na terra.</w:t>
+      <w:pPr>
+        <w:ind w:firstLine="0"/>
+      </w:pPr>
+      <w:r>
+        <w:t xml:space="preserve">Haruka olhou os três gravetos enfiados na terra.</w:t>
       </w:r>
     </w:p>
     <w:p>
@@ -12677,7 +12734,7 @@
     </w:p>
     <w:p>
       <w:r>
-        <w:t xml:space="preserve">Miguel olhou para ela. Ela riu antes que ele respondesse, pela primeira vez desde o velório, e riu parecida com o pai.</w:t>
+        <w:t xml:space="preserve">Miguel olhou para ela. Ela riu antes que ele respondesse, e riu parecida com o pai.</w:t>
       </w:r>
     </w:p>
     <w:p>
@@ -12760,7 +12817,36 @@
     </w:p>
     <w:p>
       <w:r>
-        <w:t xml:space="preserve">Os tomates amadureceram no fim de julho. Miguel chamou a família ao quintal para o primeiro, com uma solenidade que fez as meninas gemerem, e o colheu com a mão, ainda quente do sol, e o mordeu ali mesmo, em pé, com o suco escorrendo no pulso.</w:t>
+        <w:t xml:space="preserve">Naquela tarde, o Mateo apareceu no portão com um vaso vazio debaixo do braço e o Gabriel atrás. Clara tinha oferecido mudas de hortelã no grupo do galpão, e ele foi o único que respondeu. O Gabriel tinha onze anos, as pernas compridas de quem cresceu de uma vez, e um tênis branco de corrida, sem luz nenhuma. Tinha pedido assim.</w:t>
+      </w:r>
+    </w:p>
+    <w:p>
+      <w:pPr>
+        <w:ind w:firstLine="0"/>
+      </w:pPr>
+      <w:r>
+        <w:t xml:space="preserve">— Minha mãe disse que hortelã em casa pequena tem que ficar no vaso — disse o Mateo, enquanto Clara arrancava uma touceira do caminho de pedra.</w:t>
+      </w:r>
+    </w:p>
+    <w:p>
+      <w:pPr>
+        <w:ind w:firstLine="0"/>
+      </w:pPr>
+      <w:r>
+        <w:t xml:space="preserve">— O meu pai também — disse Clara. — Olha no que deu.</w:t>
+      </w:r>
+    </w:p>
+    <w:p>
+      <w:pPr>
+        <w:ind w:firstLine="0"/>
+      </w:pPr>
+      <w:r>
+        <w:t xml:space="preserve">Ficaram para o primeiro tomate.</w:t>
+      </w:r>
+    </w:p>
+    <w:p>
+      <w:r>
+        <w:t xml:space="preserve">Os tomates tinham amadurecido naquela semana. Miguel chamou todo mundo ao quintal para o primeiro, com uma solenidade que fez as meninas gemerem, e o colheu com a mão, ainda quente do sol, e o mordeu ali mesmo, em pé, com o suco escorrendo no pulso.</w:t>
       </w:r>
     </w:p>
     <w:p>
@@ -12773,7 +12859,7 @@
     </w:p>
     <w:p>
       <w:r>
-        <w:t xml:space="preserve">Clara pegou outro, do pé ao lado, entre duas folhas de hortelã, e mordeu.</w:t>
+        <w:t xml:space="preserve">O Gabriel riu da careta. Clara pegou outro, do pé ao lado, entre duas folhas de hortelã, e mordeu.</w:t>
       </w:r>
     </w:p>
     <w:p>
@@ -13115,7 +13201,7 @@
     </w:p>
     <w:p>
       <w:r>
-        <w:t xml:space="preserve">Miguel tirou a colher dos dedos dela devagar. Puxou a manta do encosto do sofá e cobriu as pernas de Clara sem mexer o ombro. O filme continuou. Ele não viu o fim. A televisão, depois de um tempo sem ninguém apertar nenhum botão, apagou sozinha, e a sala ficou só com o barulho da chuva.</w:t>
+        <w:t xml:space="preserve">Miguel tirou a colher dos dedos dela sem acordá-la. Puxou a manta do encosto do sofá e cobriu as pernas de Clara sem mexer o ombro. O filme continuou. Ele não viu o fim. A televisão, depois de um tempo sem ninguém apertar nenhum botão, apagou sozinha, e a sala ficou só com o barulho da chuva.</w:t>
       </w:r>
     </w:p>
     <w:p>
@@ -13227,7 +13313,7 @@
     </w:p>
     <w:p>
       <w:r>
-        <w:t xml:space="preserve">Sentaram na mesa da cozinha. Nina se sentou também, porque ninguém a mandou sair, e ficou quieta pela primeira vez em meses, comendo o pão do pacote sem manteiga, fatia por fatia.</w:t>
+        <w:t xml:space="preserve">Sentaram na mesa da cozinha. Nina se sentou também, porque ninguém a mandou sair, e ficou quieta, coisa rara, comendo o pão do pacote sem manteiga, fatia por fatia.</w:t>
       </w:r>
     </w:p>
     <w:p>
@@ -13273,13 +13359,98 @@
       </w:r>
     </w:p>
     <w:p>
-      <w:r>
-        <w:t xml:space="preserve">Conversaram quase duas horas. Miguel perguntou menos e ouviu mais do que sabia fazer. Maya falou de uma professora de piano que dava aula para crianças num bairro pobre de Kyoto, de uma menina que chegava à aula com fome. Falou do galpão, das músicas que aprendia antes de todo mundo. Nina adormeceu com a cabeça sobre os braços, na mesa, e ninguém a acordou.</w:t>
-      </w:r>
-    </w:p>
-    <w:p>
-      <w:r>
-        <w:t xml:space="preserve">Perto da meia-noite, Maya fechou a pasta e olhou para ele.</w:t>
+      <w:pPr>
+        <w:ind w:firstLine="0"/>
+      </w:pPr>
+      <w:r>
+        <w:t xml:space="preserve">— De onde veio isso? — perguntou ele.</w:t>
+      </w:r>
+    </w:p>
+    <w:p>
+      <w:pPr>
+        <w:ind w:firstLine="0"/>
+      </w:pPr>
+      <w:r>
+        <w:t xml:space="preserve">— De uma professora. — Maya ajeitou a pasta na frente dela. — Ela dá aula de piano num centro comunitário, perto do rio, para criança que não tem piano em casa. Eu vou aos sábados de manhã. Ajudo a afinar o ouvido dos pequenos.</w:t>
+      </w:r>
+    </w:p>
+    <w:p>
+      <w:pPr>
+        <w:ind w:firstLine="0"/>
+      </w:pPr>
+      <w:r>
+        <w:t xml:space="preserve">— Ela te paga?</w:t>
+      </w:r>
+    </w:p>
+    <w:p>
+      <w:pPr>
+        <w:ind w:firstLine="0"/>
+      </w:pPr>
+      <w:r>
+        <w:t xml:space="preserve">— Pai.</w:t>
+      </w:r>
+    </w:p>
+    <w:p>
+      <w:pPr>
+        <w:ind w:firstLine="0"/>
+      </w:pPr>
+      <w:r>
+        <w:t xml:space="preserve">— Estou perguntando.</w:t>
+      </w:r>
+    </w:p>
+    <w:p>
+      <w:pPr>
+        <w:ind w:firstLine="0"/>
+      </w:pPr>
+      <w:r>
+        <w:t xml:space="preserve">— Não paga. — Maya quase sorriu. — Tem uma menina de oito anos que chega sem café da manhã. Eu comecei a levar onigiri. Ela come e depois toca. Toca errado, toca tudo errado, e fica feliz igual.</w:t>
+      </w:r>
+    </w:p>
+    <w:p>
+      <w:r>
+        <w:t xml:space="preserve">Miguel abriu a boca para dizer quanto ganhava um professor de música no primeiro ano, e quanto ganhava um economista, e quanto custava um ano a mais em Kyoto. Tinha os três números na cabeça. Maya viu os números passarem pelo rosto dele.</w:t>
+      </w:r>
+    </w:p>
+    <w:p>
+      <w:pPr>
+        <w:ind w:firstLine="0"/>
+      </w:pPr>
+      <w:r>
+        <w:t xml:space="preserve">— Eu sei quanto é — disse. — Eu fiz a planilha.</w:t>
+      </w:r>
+    </w:p>
+    <w:p>
+      <w:r>
+        <w:t xml:space="preserve">Virou a pasta para ele e mostrou a última folha. Era uma planilha de verdade, com colunas, cenários e uma linha em negrito no fim. Miguel leu a linha. Leu de novo. Estava certa.</w:t>
+      </w:r>
+    </w:p>
+    <w:p>
+      <w:pPr>
+        <w:ind w:firstLine="0"/>
+      </w:pPr>
+      <w:r>
+        <w:t xml:space="preserve">— Quem te ensinou isso?</w:t>
+      </w:r>
+    </w:p>
+    <w:p>
+      <w:pPr>
+        <w:ind w:firstLine="0"/>
+      </w:pPr>
+      <w:r>
+        <w:t xml:space="preserve">— Você. — Maya fechou a pasta. — Sem querer.</w:t>
+      </w:r>
+    </w:p>
+    <w:p>
+      <w:r>
+        <w:t xml:space="preserve">Conversaram até perto da meia-noite. Nina adormeceu com a cabeça sobre os braços, na mesa, e ninguém a acordou.</w:t>
+      </w:r>
+    </w:p>
+    <w:p>
+      <w:pPr>
+        <w:ind w:firstLine="0"/>
+      </w:pPr>
+      <w:r>
+        <w:t xml:space="preserve">Perto da meia-noite, Maya olhou para ele.</w:t>
       </w:r>
     </w:p>
     <w:p>
@@ -13308,7 +13479,7 @@
     </w:p>
     <w:p>
       <w:r>
-        <w:t xml:space="preserve">Miguel contou nos dedos, devagar, para ela ver. A fábrica. Okinawa. A Mirai. A mesa onde estavam sentados, numa noite de dezembro, com o piano fechado entre ele e a mãe dela.</w:t>
+        <w:t xml:space="preserve">Miguel contou nos dedos, para ela ver. A fábrica. Okinawa. A Mirai. A sala ao lado, numa noite de dezembro, com o piano fechado entre ele e a mãe dela.</w:t>
       </w:r>
     </w:p>
     <w:p>
@@ -13322,6 +13493,35 @@
     <w:p>
       <w:r>
         <w:t xml:space="preserve">Maya olhou para a mãe. Clara estava secando uma xícara que já estava seca.</w:t>
+      </w:r>
+    </w:p>
+    <w:p>
+      <w:pPr>
+        <w:ind w:firstLine="0"/>
+      </w:pPr>
+      <w:r>
+        <w:t xml:space="preserve">— Eu estava no sexto degrau — disse Maya. — Naquela noite.</w:t>
+      </w:r>
+    </w:p>
+    <w:p>
+      <w:pPr>
+        <w:ind w:firstLine="0"/>
+      </w:pPr>
+      <w:r>
+        <w:t xml:space="preserve">A geladeira zumbia. Clara parou de secar a xícara.</w:t>
+      </w:r>
+    </w:p>
+    <w:p>
+      <w:pPr>
+        <w:ind w:firstLine="0"/>
+      </w:pPr>
+      <w:r>
+        <w:t xml:space="preserve">— Eu sei — disse Miguel. — Eu ouvi o degrau.</w:t>
+      </w:r>
+    </w:p>
+    <w:p>
+      <w:r>
+        <w:t xml:space="preserve">Maya sustentou o olhar dele um tempo, com a pasta fechada debaixo das mãos. Não perguntou por que ele não tinha subido. Ele também não explicou.</w:t>
       </w:r>
     </w:p>
     <w:p>
@@ -13505,7 +13705,7 @@
     </w:p>
     <w:p>
       <w:r>
-        <w:t xml:space="preserve">No bolso da jaqueta, dobrada em quatro, estava a fotocópia de duas páginas de um caderno, que a Haruka tinha mandado pelo correio no primeiro inverno depois do velório. Era a letra da Setsuko, miúda e redonda, explicando quando e onde podar uma figueira. Nas margens, em outra letra, inclinada e firme, havia anotações a lápis. Numa delas, ao lado de um desenho de galho, Mori tinha escrito: ela cortava mais do que eu teria coragem.</w:t>
+        <w:t xml:space="preserve">No bolso da jaqueta estava a fotocópia de duas páginas de um caderno, que a Haruka tinha mandado pelo correio no primeiro inverno depois do velório. Era a letra da Setsuko, miúda e redonda, explicando quando e onde podar uma figueira. Nas margens, em outra letra, inclinada e firme, havia anotações a lápis. Numa delas, ao lado de um desenho de galho, Mori tinha escrito: ela cortava mais do que eu teria coragem.</w:t>
       </w:r>
     </w:p>
     <w:p>

</xml_diff>

<commit_message>
Aplica os itens opcionais da revisão
- cap. 19: o Hayashi em cena (pedido informal do banco; o Miguel recusa)
- cap. 22: café com o Kuroda ampliado (proposta pela relação com Gifu;
  'Provavelmente não. Mas eu teria lido com mais atenção.')
- cap. 24/25: a Clara quer passar a primavera brasileira com o pai, e vai
- docs/REVISAO_V2.md atualizado; .docx regenerados

Co-Authored-By: Claude Opus 5.5 <noreply@anthropic.com>
Claude-Session: https://claude.ai/code/session_01Lr8d9xDfMU6kQFdAYADYkt
</commit_message>
<xml_diff>
--- a/saidas/O_Jardim_Entre_o_Agora_e_o_Depois.docx
+++ b/saidas/O_Jardim_Entre_o_Agora_e_o_Depois.docx
@@ -9783,7 +9783,91 @@
     </w:p>
     <w:p>
       <w:r>
-        <w:t xml:space="preserve">Os bancos ouviram a história. Dois deles, com quem a Mirai trabalhava desde o começo, passaram a pedir mais tempo de emprego e uma entrada maior para quem não tinha visto permanente. Não anunciaram nada. Simplesmente começaram a recusar casos que três meses antes teriam aprovado, com a mesma cortesia de sempre e a mesma ausência de explicação. A linha do banco de Gifu continuou aberta, mas o senhor Hayashi, de terno azul-marinho, veio pessoalmente dizer que as análises iam demorar mais.</w:t>
+        <w:t xml:space="preserve">Os bancos ouviram a história. Dois deles, com quem a Mirai trabalhava desde o começo, passaram a pedir mais tempo de emprego e uma entrada maior para quem não tinha visto permanente. Não anunciaram nada. Simplesmente começaram a recusar casos que três meses antes teriam aprovado, com a mesma cortesia de sempre e a mesma ausência de explicação. A linha do banco de Gifu continuou aberta.</w:t>
+      </w:r>
+    </w:p>
+    <w:p>
+      <w:r>
+        <w:t xml:space="preserve">O senhor Hayashi veio pessoalmente numa quinta de julho, de terno azul-marinho apesar do calor, e recusou o chá. Sentou na sala de vidro com uma pasta fina sobre os joelhos e falou olhando para a pasta.</w:t>
+      </w:r>
+    </w:p>
+    <w:p>
+      <w:pPr>
+        <w:ind w:firstLine="0"/>
+      </w:pPr>
+      <w:r>
+        <w:t xml:space="preserve">— As análises vão demorar mais.</w:t>
+      </w:r>
+    </w:p>
+    <w:p>
+      <w:pPr>
+        <w:ind w:firstLine="0"/>
+      </w:pPr>
+      <w:r>
+        <w:t xml:space="preserve">— Quanto mais?</w:t>
+      </w:r>
+    </w:p>
+    <w:p>
+      <w:pPr>
+        <w:ind w:firstLine="0"/>
+      </w:pPr>
+      <w:r>
+        <w:t xml:space="preserve">— Não sei dizer. — Ele virou uma folha que não precisava virar. — A diretoria pediu cautela com os casos sem visto permanente. Não é uma regra. É um pedido.</w:t>
+      </w:r>
+    </w:p>
+    <w:p>
+      <w:r>
+        <w:t xml:space="preserve">Miguel conhecia a diferença. Um pedido de diretoria era uma regra que ninguém tinha coragem de assinar.</w:t>
+      </w:r>
+    </w:p>
+    <w:p>
+      <w:pPr>
+        <w:ind w:firstLine="0"/>
+      </w:pPr>
+      <w:r>
+        <w:t xml:space="preserve">— E o senhor está me pedindo o quê?</w:t>
+      </w:r>
+    </w:p>
+    <w:p>
+      <w:pPr>
+        <w:ind w:firstLine="0"/>
+      </w:pPr>
+      <w:r>
+        <w:t xml:space="preserve">O senhor Hayashi ergueu os olhos da pasta.</w:t>
+      </w:r>
+    </w:p>
+    <w:p>
+      <w:pPr>
+        <w:ind w:firstLine="0"/>
+      </w:pPr>
+      <w:r>
+        <w:t xml:space="preserve">— Que a Mirai mande menos desses casos, por um tempo. Para a linha não fechar.</w:t>
+      </w:r>
+    </w:p>
+    <w:p>
+      <w:r>
+        <w:t xml:space="preserve">Na parede atrás dele, o papel com o horário de atendimento em três línguas tinha amarelado nas bordas. Miguel pensou no Mateo, que não tinha visto permanente. Pensou na dona Cida, que tinha.</w:t>
+      </w:r>
+    </w:p>
+    <w:p>
+      <w:pPr>
+        <w:ind w:firstLine="0"/>
+      </w:pPr>
+      <w:r>
+        <w:t xml:space="preserve">— Eu mando os casos que eu acredito — disse. — Todos. O senhor recusa os que precisar recusar.</w:t>
+      </w:r>
+    </w:p>
+    <w:p>
+      <w:r>
+        <w:t xml:space="preserve">O senhor Hayashi ficou calado um tempo. Depois fechou a pasta e se inclinou, um pouco mais do que a cortesia pedia.</w:t>
+      </w:r>
+    </w:p>
+    <w:p>
+      <w:pPr>
+        <w:ind w:firstLine="0"/>
+      </w:pPr>
+      <w:r>
+        <w:t xml:space="preserve">— Eu sabia que o senhor ia dizer isso — disse. — Por isso vim eu.</w:t>
       </w:r>
     </w:p>
     <w:p>
@@ -11865,6 +11949,64 @@
         <w:ind w:firstLine="0"/>
       </w:pPr>
       <w:r>
+        <w:t xml:space="preserve">Depois pôs a xícara no pires, alinhou a asa com a borda da mesa e disse, no mesmo tom:</w:t>
+      </w:r>
+    </w:p>
+    <w:p>
+      <w:pPr>
+        <w:ind w:firstLine="0"/>
+      </w:pPr>
+      <w:r>
+        <w:t xml:space="preserve">— A Next Level Home quer um banco regional. O de Gifu, de preferência. O senhor Hayashi é leal ao senhor. — Fez uma pausa curta. — Quanto a Mirai pediria para apresentar os dois?</w:t>
+      </w:r>
+    </w:p>
+    <w:p>
+      <w:r>
+        <w:t xml:space="preserve">Miguel riu, porque não esperava, e depois viu que não era piada.</w:t>
+      </w:r>
+    </w:p>
+    <w:p>
+      <w:pPr>
+        <w:ind w:firstLine="0"/>
+      </w:pPr>
+      <w:r>
+        <w:t xml:space="preserve">— Não está à venda.</w:t>
+      </w:r>
+    </w:p>
+    <w:p>
+      <w:pPr>
+        <w:ind w:firstLine="0"/>
+      </w:pPr>
+      <w:r>
+        <w:t xml:space="preserve">— Eu não perguntei se estava à venda. Perguntei quanto.</w:t>
+      </w:r>
+    </w:p>
+    <w:p>
+      <w:pPr>
+        <w:ind w:firstLine="0"/>
+      </w:pPr>
+      <w:r>
+        <w:t xml:space="preserve">— A resposta é a mesma.</w:t>
+      </w:r>
+    </w:p>
+    <w:p>
+      <w:r>
+        <w:t xml:space="preserve">Kuroda assentiu, sem desapontamento nenhum, como quem risca um item de uma lista.</w:t>
+      </w:r>
+    </w:p>
+    <w:p>
+      <w:pPr>
+        <w:ind w:firstLine="0"/>
+      </w:pPr>
+      <w:r>
+        <w:t xml:space="preserve">— Eu precisava perguntar. O comitê ia perguntar se eu perguntei.</w:t>
+      </w:r>
+    </w:p>
+    <w:p>
+      <w:pPr>
+        <w:ind w:firstLine="0"/>
+      </w:pPr>
+      <w:r>
         <w:t xml:space="preserve">— O senhor deve estar achando que recusou bem — disse Kuroda.</w:t>
       </w:r>
     </w:p>
@@ -11922,6 +12064,35 @@
       </w:pPr>
       <w:r>
         <w:t xml:space="preserve">— Não conte a ninguém.</w:t>
+      </w:r>
+    </w:p>
+    <w:p>
+      <w:pPr>
+        <w:ind w:firstLine="0"/>
+      </w:pPr>
+      <w:r>
+        <w:t xml:space="preserve">Miguel mexeu o café, que já estava frio.</w:t>
+      </w:r>
+    </w:p>
+    <w:p>
+      <w:pPr>
+        <w:ind w:firstLine="0"/>
+      </w:pPr>
+      <w:r>
+        <w:t xml:space="preserve">— O senhor teria aceitado a minha contraproposta, hoje?</w:t>
+      </w:r>
+    </w:p>
+    <w:p>
+      <w:r>
+        <w:t xml:space="preserve">Kuroda pensou. Pensou de verdade, com os olhos no carpete, e Miguel gostou dele por isso.</w:t>
+      </w:r>
+    </w:p>
+    <w:p>
+      <w:pPr>
+        <w:ind w:firstLine="0"/>
+      </w:pPr>
+      <w:r>
+        <w:t xml:space="preserve">— Provavelmente não — disse. — Mas eu teria lido com mais atenção.</w:t>
       </w:r>
     </w:p>
     <w:p>
@@ -12788,6 +12959,69 @@
     </w:p>
     <w:p>
       <w:r>
+        <w:t xml:space="preserve">Clara riu. Com a chamada já encerrada, ficou um tempo com o celular na mão, olhando a hortelã entre os tomates.</w:t>
+      </w:r>
+    </w:p>
+    <w:p>
+      <w:pPr>
+        <w:ind w:firstLine="0"/>
+      </w:pPr>
+      <w:r>
+        <w:t xml:space="preserve">— Eu quero ir para lá na primavera deles — disse a Miguel, sem se virar. — Setembro, outubro, novembro. Três meses. Amarrar tomate com ele enquanto ele ainda reclama que eu amarro errado.</w:t>
+      </w:r>
+    </w:p>
+    <w:p>
+      <w:r>
+        <w:t xml:space="preserve">Miguel fez a conta sem querer: a Mirai, a Nina na escola, as marmitas, os três meses.</w:t>
+      </w:r>
+    </w:p>
+    <w:p>
+      <w:pPr>
+        <w:ind w:firstLine="0"/>
+      </w:pPr>
+      <w:r>
+        <w:t xml:space="preserve">— Três meses é muito.</w:t>
+      </w:r>
+    </w:p>
+    <w:p>
+      <w:pPr>
+        <w:ind w:firstLine="0"/>
+      </w:pPr>
+      <w:r>
+        <w:t xml:space="preserve">— É. — Clara se agachou e começou a arrancar a hortelã do caminho de pedra com a mão. — Eu só fui quando alguém ficou doente. Quero ir uma vez antes.</w:t>
+      </w:r>
+    </w:p>
+    <w:p>
+      <w:r>
+        <w:t xml:space="preserve">Ele não respondeu logo. Ela não esperou a resposta para continuar arrancando.</w:t>
+      </w:r>
+    </w:p>
+    <w:p>
+      <w:pPr>
+        <w:ind w:firstLine="0"/>
+      </w:pPr>
+      <w:r>
+        <w:t xml:space="preserve">— Vai — disse Miguel, por fim.</w:t>
+      </w:r>
+    </w:p>
+    <w:p>
+      <w:pPr>
+        <w:ind w:firstLine="0"/>
+      </w:pPr>
+      <w:r>
+        <w:t xml:space="preserve">— Eu não estava pedindo.</w:t>
+      </w:r>
+    </w:p>
+    <w:p>
+      <w:pPr>
+        <w:ind w:firstLine="0"/>
+      </w:pPr>
+      <w:r>
+        <w:t xml:space="preserve">— Eu sei.</w:t>
+      </w:r>
+    </w:p>
+    <w:p>
+      <w:r>
         <w:t xml:space="preserve">As quatro placas estavam pregadas na cerca de madeira do fundo, desde o verão anterior, uma ao lado da outra, na ordem. Nina, que tinha treze anos e opinião sobre tudo, olhou para elas enquanto a mãe falava com o avô.</w:t>
       </w:r>
     </w:p>
@@ -12894,7 +13128,7 @@
     </w:p>
     <w:p>
       <w:r>
-        <w:t xml:space="preserve">Miguel escreveu a carta em fevereiro do oitavo ano, na mesa da cozinha, depois que todos dormiam, em sete noites e onze versões.</w:t>
+        <w:t xml:space="preserve">Clara tinha ido duas primaveras seguidas para o interior, três meses cada vez, e voltado com as mãos marcadas de barbante e um sotaque que levava uma semana para passar. Miguel escreveu a carta em fevereiro do oitavo ano, na mesa da cozinha, depois que todos dormiam, em sete noites e onze versões.</w:t>
       </w:r>
     </w:p>
     <w:p>

</xml_diff>

<commit_message>
Atualiza o livro com o dossiê Contentamento Dinâmico
- cap. 2: seishain, CX-5 e a pergunta 'É isso?' antes de Okinawa
- cap. 7: dignidade × autoapagamento (as sobras; a Clara reduzida a uma função)
- cap. 11: dupla fenda corrigida pelo Renato; Salmo 139
- cap. 15: o Mori admite limite
- cap. 19: identidade antes do resultado
- cap. 23: Haidt (não Taleb) e a ilusão de foco no trabalho da Maya
- cap. 26: Okinawa sem providência simplista
- NOTAS DO AUTOR depois do epílogo (fontes, limites, ficção × realidade)
- docs: dossiê, registro da atualização, bíblia e CLAUDE.md
- build.py inclui as notas; .docx regenerados

Co-Authored-By: Claude Opus 5.5 <noreply@anthropic.com>
Claude-Session: https://claude.ai/code/session_01Lr8d9xDfMU6kQFdAYADYkt
</commit_message>
<xml_diff>
--- a/saidas/O_Jardim_Entre_o_Agora_e_o_Depois.docx
+++ b/saidas/O_Jardim_Entre_o_Agora_e_o_Depois.docx
@@ -1060,6 +1060,27 @@
         <w:ind w:firstLine="0"/>
       </w:pPr>
       <w:r>
+        <w:t xml:space="preserve">Antes de Okinawa houve uma pergunta. Fazia três anos que ele era seishain, funcionário efetivo da fábrica, com salário no dia vinte e cinco e bônus duas vezes por ano. Tinha a casa. Tinha a CX-5 seminova, preta, que ele passara quatro meses escolhendo em sites de carros usados e quatro semanas lavando aos domingos. Numa segunda-feira de manhã, parado no estacionamento da fábrica antes do turno, com o motor ligado por causa do frio, ouviu a própria voz perguntar, para ninguém:</w:t>
+      </w:r>
+    </w:p>
+    <w:p>
+      <w:pPr>
+        <w:ind w:firstLine="0"/>
+      </w:pPr>
+      <w:r>
+        <w:t xml:space="preserve">— É isso?</w:t>
+      </w:r>
+    </w:p>
+    <w:p>
+      <w:r>
+        <w:t xml:space="preserve">Podia ser ingratidão. Podia ser outra coisa, uma fome que ainda não tinha nome. Ele respondeu à pergunta do jeito que sabia: com um plano.</w:t>
+      </w:r>
+    </w:p>
+    <w:p>
+      <w:pPr>
+        <w:ind w:firstLine="0"/>
+      </w:pPr>
+      <w:r>
         <w:t xml:space="preserve">O plano parecera perfeito. O país ensaiava sair das restrições mais duras da pandemia, e o primeiro verão com cara de turismo prometia devolver gente às praias, aos hotéis e aos estacionamentos onde pequenos empreendedores estacionavam seus sonhos sobre rodas. Clara faria a comida; Miguel cuidaria das contas e do balcão. As meninas passariam cinco semanas perto do mar. Na primeira noite, Clara chegou a orar pelo food truck, ajoelhada ao lado da cama do apartamento, e Miguel, da porta, fez a piada de sempre:</w:t>
       </w:r>
     </w:p>
@@ -3580,6 +3601,111 @@
     <w:p>
       <w:r>
         <w:t xml:space="preserve">Falaram das meninas, depois de nada, depois de uma viagem que tinham feito antes de casar e da qual ele não se lembrava direito. Clara lembrava de tudo. Na saída, ele notou que tinha passado cinquenta minutos sem olhar o relógio e sentiu uma coisa parecida com culpa, só que ao contrário.</w:t>
+      </w:r>
+    </w:p>
+    <w:p>
+      <w:r>
+        <w:t xml:space="preserve">Na quarta quinta-feira, Clara chegou vinte minutos atrasada, com o celular da empresa na mão, pedindo desculpas, e Miguel disse que estava tudo bem, que vinte minutos já eram bons.</w:t>
+      </w:r>
+    </w:p>
+    <w:p>
+      <w:pPr>
+        <w:ind w:firstLine="0"/>
+      </w:pPr>
+      <w:r>
+        <w:t xml:space="preserve">Ela sentou e o olhou por cima da xícara.</w:t>
+      </w:r>
+    </w:p>
+    <w:p>
+      <w:pPr>
+        <w:ind w:firstLine="0"/>
+      </w:pPr>
+      <w:r>
+        <w:t xml:space="preserve">— Você sempre diz isso.</w:t>
+      </w:r>
+    </w:p>
+    <w:p>
+      <w:pPr>
+        <w:ind w:firstLine="0"/>
+      </w:pPr>
+      <w:r>
+        <w:t xml:space="preserve">— Isso o quê?</w:t>
+      </w:r>
+    </w:p>
+    <w:p>
+      <w:pPr>
+        <w:ind w:firstLine="0"/>
+      </w:pPr>
+      <w:r>
+        <w:t xml:space="preserve">— Que está bom. Vinte minutos, está bom. Meia-noite e dez, quando eu fecho o notebook e sobra um pedaço de mim, está bom. — Pôs o celular com a tela para baixo. — Você nunca pede nada.</w:t>
+      </w:r>
+    </w:p>
+    <w:p>
+      <w:r>
+        <w:t xml:space="preserve">Miguel mexeu o café. Lembrou, sem querer, do pátio da escola no Brasil, onde o japonês da sala aprendera cedo que ficava com o que sobrava se não pedisse muito.</w:t>
+      </w:r>
+    </w:p>
+    <w:p>
+      <w:pPr>
+        <w:ind w:firstLine="0"/>
+      </w:pPr>
+      <w:r>
+        <w:t xml:space="preserve">— Eu achava que pedir mais era ser ingrato.</w:t>
+      </w:r>
+    </w:p>
+    <w:p>
+      <w:pPr>
+        <w:ind w:firstLine="0"/>
+      </w:pPr>
+      <w:r>
+        <w:t xml:space="preserve">— E eu achei que você estava bem porque nunca dizia.</w:t>
+      </w:r>
+    </w:p>
+    <w:p>
+      <w:pPr>
+        <w:ind w:firstLine="0"/>
+      </w:pPr>
+      <w:r>
+        <w:t xml:space="preserve">— Eu não estava bem. Também não soube dizer.</w:t>
+      </w:r>
+    </w:p>
+    <w:p>
+      <w:r>
+        <w:t xml:space="preserve">Clara ficou quieta. Depois disse uma coisa que ele não esperava.</w:t>
+      </w:r>
+    </w:p>
+    <w:p>
+      <w:pPr>
+        <w:ind w:firstLine="0"/>
+      </w:pPr>
+      <w:r>
+        <w:t xml:space="preserve">— Eu também não estou. Na empresa eu sou a que responde cliente depois das dez. Em casa eu sou a que lembra da reunião de pais. Faz tempo que ninguém me pergunta o que eu quero.</w:t>
+      </w:r>
+    </w:p>
+    <w:p>
+      <w:pPr>
+        <w:ind w:firstLine="0"/>
+      </w:pPr>
+      <w:r>
+        <w:t xml:space="preserve">— O que você quer?</w:t>
+      </w:r>
+    </w:p>
+    <w:p>
+      <w:r>
+        <w:t xml:space="preserve">Ela abriu a boca e não soube responder de imediato, e os dois riram disso, sem graça.</w:t>
+      </w:r>
+    </w:p>
+    <w:p>
+      <w:pPr>
+        <w:ind w:firstLine="0"/>
+      </w:pPr>
+      <w:r>
+        <w:t xml:space="preserve">— Começar pela quinta-feira — disse. — Sem desconto.</w:t>
+      </w:r>
+    </w:p>
+    <w:p>
+      <w:r>
+        <w:t xml:space="preserve">Na semana seguinte, o número do celular dela sumiu do site da Mirai.</w:t>
       </w:r>
     </w:p>
     <w:p>
@@ -5590,6 +5716,56 @@
     </w:p>
     <w:p>
       <w:r>
+        <w:t xml:space="preserve">Numa dessas terças, Miguel chegou com uma pergunta tirada de um vídeo visto de madrugada.</w:t>
+      </w:r>
+    </w:p>
+    <w:p>
+      <w:pPr>
+        <w:ind w:firstLine="0"/>
+      </w:pPr>
+      <w:r>
+        <w:t xml:space="preserve">— Dizem que na física quântica o observador muda o resultado. Que a partícula se comporta diferente quando alguém olha. Pensei que isso podia ser um jeito de explicar Deus.</w:t>
+      </w:r>
+    </w:p>
+    <w:p>
+      <w:pPr>
+        <w:ind w:firstLine="0"/>
+      </w:pPr>
+      <w:r>
+        <w:t xml:space="preserve">Renato pôs a pilha de cadeiras no chão e coçou a nuca.</w:t>
+      </w:r>
+    </w:p>
+    <w:p>
+      <w:pPr>
+        <w:ind w:firstLine="0"/>
+      </w:pPr>
+      <w:r>
+        <w:t xml:space="preserve">— Eu monto compressor, Miguel. De física eu sei o que o manual diz. — Pensou. — Mas o rapaz da manutenção, que fez faculdade, me explicou uma vez que nesse experimento olhar quer dizer medir, pôr um aparelho no caminho. Não tem nada a ver com alguém prestando atenção.</w:t>
+      </w:r>
+    </w:p>
+    <w:p>
+      <w:pPr>
+        <w:ind w:firstLine="0"/>
+      </w:pPr>
+      <w:r>
+        <w:t xml:space="preserve">— Então não serve.</w:t>
+      </w:r>
+    </w:p>
+    <w:p>
+      <w:pPr>
+        <w:ind w:firstLine="0"/>
+      </w:pPr>
+      <w:r>
+        <w:t xml:space="preserve">— Para provar Deus, acho que não. — Renato pegou a pilha de novo. — Mas você não precisa de partícula para saber que é visto. O salmista não tinha laboratório.</w:t>
+      </w:r>
+    </w:p>
+    <w:p>
+      <w:r>
+        <w:t xml:space="preserve">Em casa, Miguel procurou o salmo. Era o cento e trinta e nove. Leu duas vezes, e na segunda não procurou argumento nenhum.</w:t>
+      </w:r>
+    </w:p>
+    <w:p>
+      <w:r>
         <w:t xml:space="preserve">Clara lhe deu uma Bíblia de papel, com capa de couro falso, a primeira coisa que ele lia em papel em anos. Miguel leu os Evangelhos devagar, com a desconfiança de quem lê um contrato. Depois leu Filipenses, porque era curta, e uma frase do quarto capítulo o fez parar na cama, com o abajur aceso até tarde.</w:t>
       </w:r>
     </w:p>
@@ -7780,6 +7956,30 @@
         <w:ind w:firstLine="0"/>
       </w:pPr>
       <w:r>
+        <w:t xml:space="preserve">— E a sua mulher, o que diz?</w:t>
+      </w:r>
+    </w:p>
+    <w:p>
+      <w:pPr>
+        <w:ind w:firstLine="0"/>
+      </w:pPr>
+      <w:r>
+        <w:t xml:space="preserve">— Que está com medo.</w:t>
+      </w:r>
+    </w:p>
+    <w:p>
+      <w:pPr>
+        <w:ind w:firstLine="0"/>
+      </w:pPr>
+      <w:r>
+        <w:t xml:space="preserve">— Disso eu não entendo. — Mori ajustou um dedo da luva. — Quem entendia de casamento nesta casa era a Setsuko. Eu entendo de nabo.</w:t>
+      </w:r>
+    </w:p>
+    <w:p>
+      <w:pPr>
+        <w:ind w:firstLine="0"/>
+      </w:pPr>
+      <w:r>
         <w:t xml:space="preserve">— Quando eu não sei quanto uma coisa vale — disse —, faço de conta que ela nunca existiu.</w:t>
       </w:r>
     </w:p>
@@ -9788,7 +9988,7 @@
     </w:p>
     <w:p>
       <w:r>
-        <w:t xml:space="preserve">O senhor Hayashi veio pessoalmente numa quinta de julho, de terno azul-marinho apesar do calor, e recusou o chá. Sentou na sala de vidro com uma pasta fina sobre os joelhos e falou olhando para a pasta.</w:t>
+        <w:t xml:space="preserve">O senhor Hayashi veio numa quinta de julho, de terno azul-marinho apesar do calor, e recusou o chá. Sentou na sala de vidro com uma pasta fina sobre os joelhos e falou olhando para a pasta.</w:t>
       </w:r>
     </w:p>
     <w:p>
@@ -9846,7 +10046,7 @@
     </w:p>
     <w:p>
       <w:r>
-        <w:t xml:space="preserve">Na parede atrás dele, o papel com o horário de atendimento em três línguas tinha amarelado nas bordas. Miguel pensou no Mateo, que não tinha visto permanente. Pensou na dona Cida, que tinha.</w:t>
+        <w:t xml:space="preserve">Miguel pensou no Mateo, que não tinha visto permanente. Pensou na dona Cida, que tinha.</w:t>
       </w:r>
     </w:p>
     <w:p>
@@ -9882,7 +10082,7 @@
     </w:p>
     <w:p>
       <w:r>
-        <w:t xml:space="preserve">Miguel cortou o que podia cortar sem cortar gente. O andar de cima da filial de Nagoya, que tinha sido alugado para a expansão que não houve. A campanha de internet, que trazia contatos de pessoas que não podiam comprar nada. O carro da empresa. O bônus de verão ficou em metade do previsto, e ele explicou o motivo numa reunião em que ninguém fez pergunta, o que era pior do que se todos tivessem feito.</w:t>
+        <w:t xml:space="preserve">Miguel cortou o que podia cortar sem cortar gente. O andar de cima da filial de Nagoya, que tinha sido alugado para a expansão que não houve. O carro da empresa. O bônus de verão ficou em metade do previsto, e ele explicou o motivo numa reunião em que ninguém fez pergunta, o que era pior do que se todos tivessem feito.</w:t>
       </w:r>
     </w:p>
     <w:p>
@@ -10020,6 +10220,30 @@
     <w:p>
       <w:r>
         <w:t xml:space="preserve">Miguel riu contra a vontade, e a risada ecoou no telhado de zinco.</w:t>
+      </w:r>
+    </w:p>
+    <w:p>
+      <w:pPr>
+        <w:ind w:firstLine="0"/>
+      </w:pPr>
+      <w:r>
+        <w:t xml:space="preserve">— E se eu perdi mesmo? — perguntou, mais baixo. — E se aquilo não volta?</w:t>
+      </w:r>
+    </w:p>
+    <w:p>
+      <w:pPr>
+        <w:ind w:firstLine="0"/>
+      </w:pPr>
+      <w:r>
+        <w:t xml:space="preserve">Renato encostou a pilha na parede.</w:t>
+      </w:r>
+    </w:p>
+    <w:p>
+      <w:pPr>
+        <w:ind w:firstLine="0"/>
+      </w:pPr>
+      <w:r>
+        <w:t xml:space="preserve">— Isso vai doer. — Esperou. — Mas não vai decidir se você é amado.</w:t>
       </w:r>
     </w:p>
     <w:p>
@@ -12531,6 +12755,54 @@
         <w:ind w:firstLine="0"/>
       </w:pPr>
       <w:r>
+        <w:t xml:space="preserve">— Pai, quem é que fala do elefante e do cavaleiro? Você disse que era o Taleb.</w:t>
+      </w:r>
+    </w:p>
+    <w:p>
+      <w:pPr>
+        <w:ind w:firstLine="0"/>
+      </w:pPr>
+      <w:r>
+        <w:t xml:space="preserve">— É o Taleb.</w:t>
+      </w:r>
+    </w:p>
+    <w:p>
+      <w:pPr>
+        <w:ind w:firstLine="0"/>
+      </w:pPr>
+      <w:r>
+        <w:t xml:space="preserve">— Não é. — Maya virou o celular para ele. — É o Haidt. O Taleb é o do cisne negro. A professora riscou de vermelho.</w:t>
+      </w:r>
+    </w:p>
+    <w:p>
+      <w:pPr>
+        <w:ind w:firstLine="0"/>
+      </w:pPr>
+      <w:r>
+        <w:t xml:space="preserve">Miguel abriu a boca para defender o Taleb e desistiu.</w:t>
+      </w:r>
+    </w:p>
+    <w:p>
+      <w:pPr>
+        <w:ind w:firstLine="0"/>
+      </w:pPr>
+      <w:r>
+        <w:t xml:space="preserve">— O Kahneman eu pus certo — continuou ela. — Tem uma coisa dele que chama ilusão de foco. A gente acha que uma coisa vai mudar a vida inteira só porque está pensando nela. — Olhou em volta, para as taças, o mar escuro, o garçom. — Tipo resort.</w:t>
+      </w:r>
+    </w:p>
+    <w:p>
+      <w:pPr>
+        <w:ind w:firstLine="0"/>
+      </w:pPr>
+      <w:r>
+        <w:t xml:space="preserve">— Tipo resort — repetiu Nina, de boca cheia, sem saber do que se tratava.</w:t>
+      </w:r>
+    </w:p>
+    <w:p>
+      <w:pPr>
+        <w:ind w:firstLine="0"/>
+      </w:pPr>
+      <w:r>
         <w:t xml:space="preserve">— O problema do meu trabalho é que eu preciso de um nome. Tipo um conceito. A professora quer que a gente invente um. — Ela olhou para o teto. — Porque tem gente que acha que ser feliz é querer menos. E tem gente que acha que é ter mais. E vocês ficaram anos brigando nisso, e agora vocês ficam os dois ao mesmo tempo. Querendo e gostando. Tipo contentamento, só que andando.</w:t>
       </w:r>
     </w:p>
@@ -13725,6 +13997,27 @@
       </w:r>
     </w:p>
     <w:p>
+      <w:pPr>
+        <w:ind w:firstLine="0"/>
+      </w:pPr>
+      <w:r>
+        <w:t xml:space="preserve">— E Okinawa? — perguntou Maya. — Você acha que tinha que dar errado? Para ter a Mirai?</w:t>
+      </w:r>
+    </w:p>
+    <w:p>
+      <w:r>
+        <w:t xml:space="preserve">Miguel pensou no balcão de metal, no frango esfriando, no azulejo do banheiro.</w:t>
+      </w:r>
+    </w:p>
+    <w:p>
+      <w:pPr>
+        <w:ind w:firstLine="0"/>
+      </w:pPr>
+      <w:r>
+        <w:t xml:space="preserve">— Não. Acho que deu errado. — Demorou. — E depois a gente fez alguma coisa com o que sobrou.</w:t>
+      </w:r>
+    </w:p>
+    <w:p>
       <w:r>
         <w:t xml:space="preserve">Maya olhou para a mãe. Clara estava secando uma xícara que já estava seca.</w:t>
       </w:r>
@@ -14020,6 +14313,162 @@
       </w:pPr>
       <w:r>
         <w:t xml:space="preserve">— Ainda bem.</w:t>
+      </w:r>
+    </w:p>
+    <w:p>
+      <w:r>
+        <w:br w:type="page"/>
+      </w:r>
+    </w:p>
+    <w:p>
+      <w:pPr>
+        <w:pStyle w:val="MyChapterTitle"/>
+        <w:spacing w:before="1100" w:after="560"/>
+      </w:pPr>
+      <w:r>
+        <w:t xml:space="preserve">NOTAS DO AUTOR</w:t>
+      </w:r>
+    </w:p>
+    <w:p>
+      <w:r>
+        <w:t xml:space="preserve">Este livro é ficção. Miguel, Clara, Maya, Nina, o senhor Mori, o Mateo e todos os outros personagens foram inventados, assim como a Mirai Home, o fundo do Kuroda e a Next Level Home. Alguns acontecimentos nasceram de experiências reais da minha família — a imigração, a primeira casa no Japão, um negócio que deu errado em Okinawa, uma tarde numa praia comum —, mas foram transformados pela história e não devem ser lidos como relato biográfico. Os personagens não são retratos de pessoas reais, e as falas deles são deles.</w:t>
+      </w:r>
+    </w:p>
+    <w:p>
+      <w:pPr>
+        <w:spacing w:before="240" w:after="240"/>
+        <w:ind w:firstLine="0"/>
+        <w:jc w:val="center"/>
+      </w:pPr>
+      <w:r>
+        <w:t xml:space="preserve">*</w:t>
+      </w:r>
+    </w:p>
+    <w:p>
+      <w:pPr>
+        <w:ind w:firstLine="0"/>
+      </w:pPr>
+      <w:r>
+        <w:t xml:space="preserve">As ideias que aparecem no romance também não são teoria validada. São a tentativa de uma família comum de entender a própria vida enquanto ela acontece. Ao longo da escrita, conversei com alguns autores e pesquisas que ajudaram a examinar perguntas que nasceram da experiência, e não o contrário. Nenhum deles criou, comprovou ou endossou o que os personagens vão descobrindo. Registro aqui, com os devidos cuidados, de onde vieram algumas palavras e alguns limites.</w:t>
+      </w:r>
+    </w:p>
+    <w:p>
+      <w:pPr>
+        <w:spacing w:before="240" w:after="240"/>
+        <w:ind w:firstLine="0"/>
+        <w:jc w:val="center"/>
+      </w:pPr>
+      <w:r>
+        <w:t xml:space="preserve">*</w:t>
+      </w:r>
+    </w:p>
+    <w:p>
+      <w:pPr>
+        <w:ind w:firstLine="0"/>
+      </w:pPr>
+      <w:r>
+        <w:t xml:space="preserve">A régua que se move (caps. 3, 9, 14 e 19). A casa que parece pequena depois da visita à casa maior, a praia que parece sem nada depois de Ishigaki e o pão que ontem estava bom conversam com três ideias da psicologia: a comparação social, os pontos de referência e a adaptação às coisas boas. Nenhuma delas é lei. A adaptação varia de pessoa para pessoa e nem sempre é completa; comparar-se pode inspirar ou ferir; e, às vezes, querer outra casa não é comparação, é necessidade real.</w:t>
+      </w:r>
+    </w:p>
+    <w:p>
+      <w:r>
+        <w:t xml:space="preserve">Querer e gostar (cap. 22). A distinção que a Naomi desenha no guardanapo vem da pesquisa sobre recompensa, em que o desejo de buscar e o prazer de desfrutar não são a mesma coisa. Usei a imagem de forma livre: desejar um carro ou uma empresa maior não é diagnóstico de nada.</w:t>
+      </w:r>
+    </w:p>
+    <w:p>
+      <w:r>
+        <w:t xml:space="preserve">Imaginar a ausência (cap. 15). O exercício do senhor Mori lembra experimentos de subtração mental, em que imaginar que algo bom não aconteceu ajuda a reconhecê-lo. É um exercício de imaginação. Ninguém precisa passar por privação real para aprender gratidão.</w:t>
+      </w:r>
+    </w:p>
+    <w:p>
+      <w:r>
+        <w:t xml:space="preserve">O que se vive e o que se lembra (caps. 9 e 23). A diferença entre viver uma tarde e contar essa tarde depois, assim como a ilusão de foco que a Maya cita no trabalho da escola, vem de Daniel Kahneman. Os Sistemas 1 e 2, de que o livro quase não fala pelo nome, são descrições do funcionamento do pensamento, não duas regiões do cérebro, e nenhum dos dois é o lado bom ou o lado ruim.</w:t>
+      </w:r>
+    </w:p>
+    <w:p>
+      <w:r>
+        <w:t xml:space="preserve">O elefante e o cavaleiro (cap. 23). A metáfora é de Jonathan Haidt, não de Nassim Taleb, como a Maya corrige o pai. De Taleb vêm outras ideias que atravessam o livro de forma discreta: tirar o que faz mal antes de acrescentar mais coisas, como na capina, e desconfiar das histórias arrumadas demais que contamos depois que tudo passou. Por isso o Miguel diz à filha que Okinawa não tinha que dar errado. Deu errado, e depois a família fez alguma coisa com o que sobrou. Sofrer não foi necessário para que algo bom viesse depois.</w:t>
+      </w:r>
+    </w:p>
+    <w:p>
+      <w:r>
+        <w:t xml:space="preserve">Agradecer e pedir (caps. 7 e 19). Ficar satisfeito com pouco por medo de perder alguém não é a mesma coisa que reconhecer o que se tem. A conversa de quinta-feira no kissaten existe para separar as duas coisas: é possível agradecer um gesto e, no mesmo dia, dizer que a relação precisa mudar.</w:t>
+      </w:r>
+    </w:p>
+    <w:p>
+      <w:r>
+        <w:t xml:space="preserve">A dupla fenda (cap. 11). O Renato tem razão: no experimento da dupla fenda, observar quer dizer medir, interagir com o sistema por meio de um aparelho. O experimento não prova Deus, não mostra que a atenção humana altera acontecimentos e não diz nada sobre gratidão. A pergunta do Miguel é legítima; a resposta dele, no fim, vem de outro lugar.</w:t>
+      </w:r>
+    </w:p>
+    <w:p>
+      <w:pPr>
+        <w:spacing w:before="240" w:after="240"/>
+        <w:ind w:firstLine="0"/>
+        <w:jc w:val="center"/>
+      </w:pPr>
+      <w:r>
+        <w:t xml:space="preserve">*</w:t>
+      </w:r>
+    </w:p>
+    <w:p>
+      <w:pPr>
+        <w:ind w:firstLine="0"/>
+      </w:pPr>
+      <w:r>
+        <w:t xml:space="preserve">A fé do livro é cristã, como a minha. Nela, a gratidão é resposta a um amor recebido antes, e não pagamento para receber mais. Deus não aparece como um patrão que recompensa indicadores de bom comportamento, e a prosperidade dos personagens não é certificado de nada. As passagens bíblicas que atravessam a história — Filipenses 4, com o contentamento aprendido tanto na fartura quanto na falta; Mateus 6 e 11; Deuteronômio 8; 1 Timóteo 6; Romanos 8; Gálatas 6; 1 João 4:19; e o Salmo 139 — aparecem parafraseadas, sem citação literal, e devem ser lidas no seu contexto. Nenhuma delas promete riqueza a quem agradece. A fé dos personagens também não os torna melhores do que quem não crê. Há gente generosa no livro que não pisa no galpão.</w:t>
+      </w:r>
+    </w:p>
+    <w:p>
+      <w:pPr>
+        <w:spacing w:before="240" w:after="240"/>
+        <w:ind w:firstLine="0"/>
+        <w:jc w:val="center"/>
+      </w:pPr>
+      <w:r>
+        <w:t xml:space="preserve">*</w:t>
+      </w:r>
+    </w:p>
+    <w:p>
+      <w:pPr>
+        <w:ind w:firstLine="0"/>
+      </w:pPr>
+      <w:r>
+        <w:t xml:space="preserve">Algumas das leituras que acompanharam a escrita:</w:t>
+      </w:r>
+    </w:p>
+    <w:p>
+      <w:r>
+        <w:t xml:space="preserve">Daniel Kahneman, Rápido e devagar: duas formas de pensar (Thinking, Fast and Slow, 2011); D. Kahneman e A. Tversky, "Prospect Theory" (1979); D. Schkade e D. Kahneman, sobre a ilusão de foco (1998); D. Kahneman e A. Deaton (2010) e M. Killingsworth, D. Kahneman e B. Mellers (2023), sobre renda e bem-estar.</w:t>
+      </w:r>
+    </w:p>
+    <w:p>
+      <w:r>
+        <w:t xml:space="preserve">Jonathan Haidt, A hipótese da felicidade (The Happiness Hypothesis, 2006).</w:t>
+      </w:r>
+    </w:p>
+    <w:p>
+      <w:r>
+        <w:t xml:space="preserve">Nassim Nicholas Taleb, Antifrágil (Antifragile, 2012) e A lógica do cisne negro (The Black Swan).</w:t>
+      </w:r>
+    </w:p>
+    <w:p>
+      <w:r>
+        <w:t xml:space="preserve">L. Festinger, sobre comparação social (1954); E. Diener, R. Lucas e C. Scollon, sobre os limites da adaptação (2006); K. Berridge e T. Robinson, sobre querer e gostar (2016); M. Koo, S. Algoe, T. Wilson e D. Gilbert, sobre subtração mental (2008); F. Bryant, sobre savoring (2021); B. Fredrickson, sobre emoções positivas (2001).</w:t>
+      </w:r>
+    </w:p>
+    <w:p>
+      <w:r>
+        <w:t xml:space="preserve">R. Ryan e E. Deci, sobre autonomia, competência e pertencimento (2000); C. Wrosch e colaboradores, sobre desistir e retomar metas (2003); C. Park, sobre a busca de sentido (2010); D. McAdams e K. McLean, sobre identidade narrativa (2013); F. Amstad e colaboradores, sobre o conflito entre trabalho e família (2011); G. Downey e S. Feldman, sobre sensibilidade à rejeição (1996).</w:t>
+      </w:r>
+    </w:p>
+    <w:p>
+      <w:r>
+        <w:t xml:space="preserve">R. Feynman, R. Leighton e M. Sands, As lições de física de Feynman, volume III, capítulo 1.</w:t>
+      </w:r>
+    </w:p>
+    <w:p>
+      <w:r>
+        <w:t xml:space="preserve">As paráfrases deste livro não são citações desses autores. Quem quiser se aprofundar deve ir às obras, que dizem mais, e melhor, do que qualquer personagem.</w:t>
       </w:r>
     </w:p>
     <w:sectPr>

</xml_diff>